<commit_message>
feat(ai): add Anthropic Claude as primary provider, refactor build pipeline, clean milestone_13_2
- Add Anthropic/Claude Sonnet 4 as primary AI provider with DPAPI-encrypted key
- Keep Groq qwen3 as fallback for explore/debug/audit agents
- Update academix-launcher.ps1: Anthropic section [2/7], Groq fallback [3/7]
- Update opencode.json, instructions.md, CLAUDE.md for Claude primary
- Refactor build pipeline: 6-step process with user's original DOCX style source
- Add format-tables.py for #0C447C / #EBF5FB table styling
- Remove milestone_13_2 directory (moved to root level)
</commit_message>
<xml_diff>
--- a/Thesis_Surgical_Edit/style/reference.docx
+++ b/Thesis_Surgical_Edit/style/reference.docx
@@ -318,7 +318,7 @@
         <w:numRestart w:val="eachSect"/>
       </w:footnotePr>
       <w:pgSz w:w="11906" w:h="16838"/>
-      <w:pgMar w:top="2275" w:bottom="2275" w:left="2275" w:right="2275"/>
+      <w:pgMar w:top="1440" w:bottom="1440" w:left="1701" w:right="1701"/>
     </w:sectPr>
   </w:body>
 </w:document>
@@ -487,31 +487,17 @@
   <w:docDefaults>
     <w:rPrDefault>
       <w:rPr>
-        <w:rFonts w:ascii="Traditional Arabic" w:hAnsi="Traditional Arabic" w:eastAsia="Traditional Arabic" w:cs="Traditional Arabic"/>
-        <w:sz w:val="28"/>
-        <w:szCs w:val="28"/>
-        <w:lang w:val="en-US" w:eastAsia="en-US" w:bidi="ar-SA"/>
+        <w:rFonts w:ascii="Traditional Arabic" w:cs="Traditional Arabic" w:eastAsia="Traditional Arabic" w:hAnsi="Traditional Arabic"/>
+        <w:sz w:val="24"/>
+        <w:szCs w:val="24"/>
       </w:rPr>
     </w:rPrDefault>
-    <w:pPrDefault>
-      <w:pPr>
-        <w:spacing w:line="360" w:lineRule="auto"/>
-        <w:jc w:val="right"/>
-      </w:pPr>
-    </w:pPrDefault>
+    <w:pPrDefault/>
   </w:docDefaults>
   <w:latentStyles w:defLockedState="0" w:defUIPriority="0" w:defSemiHidden="0" w:defUnhideWhenUsed="0" w:defQFormat="0" w:count="276"/>
   <w:style w:type="paragraph" w:default="1" w:styleId="Normal">
-    <w:pPr>
-      <w:jc w:val="right"/>
-      <w:spacing w:line="360" w:lineRule="auto"/>
-    </w:pPr>
     <w:name w:val="Normal"/>
     <w:qFormat/>
-    <w:rPr>
-      <w:rFonts w:ascii="Traditional Arabic" w:hAnsi="Traditional Arabic" w:eastAsia="Traditional Arabic" w:cs="Traditional Arabic"/>
-      <w:lang w:val="en-US" w:eastAsia="en-US" w:bidi="ar-SA"/>
-    </w:rPr>
   </w:style>
   <w:style w:type="paragraph" w:styleId="BodyText">
     <w:name w:val="Body Text"/>
@@ -545,14 +531,14 @@
     <w:qFormat/>
     <w:rsid w:val="00A10FD9"/>
     <w:pPr>
+      <w:spacing w:after="80" w:line="240" w:lineRule="auto"/>
       <w:contextualSpacing/>
       <w:jc w:val="center"/>
     </w:pPr>
     <w:rPr>
-      <w:rFonts w:ascii="Traditional Arabic" w:hAnsi="Traditional Arabic" w:eastAsia="Traditional Arabic" w:cs="Traditional Arabic"/>
+      <w:rFonts w:asciiTheme="majorHAnsi" w:eastAsiaTheme="majorEastAsia" w:hAnsiTheme="majorHAnsi" w:cstheme="majorBidi"/>
       <w:sz w:val="56"/>
       <w:szCs w:val="56"/>
-      <w:lang w:val="en-US" w:eastAsia="en-US" w:bidi="ar-SA"/>
     </w:rPr>
   </w:style>
   <w:style w:type="character" w:customStyle="1" w:styleId="TitleChar">
@@ -579,14 +565,12 @@
       <w:numPr>
         <w:ilvl w:val="1"/>
       </w:numPr>
-      <w:jc w:val="right"/>
-    </w:pPr>
-    <w:rPr>
-      <w:rFonts w:ascii="Traditional Arabic" w:hAnsi="Traditional Arabic" w:eastAsia="Traditional Arabic" w:cs="Traditional Arabic"/>
+    </w:pPr>
+    <w:rPr>
+      <w:rFonts w:eastAsiaTheme="majorEastAsia" w:cstheme="majorBidi"/>
       <w:spacing w:val="15"/>
       <w:sz w:val="28"/>
       <w:szCs w:val="28"/>
-      <w:lang w:val="en-US" w:eastAsia="en-US" w:bidi="ar-SA"/>
     </w:rPr>
   </w:style>
   <w:style w:type="character" w:customStyle="1" w:styleId="SubtitleChar">
@@ -682,15 +666,14 @@
     <w:pPr>
       <w:keepNext/>
       <w:keepLines/>
+      <w:spacing w:before="360" w:after="80"/>
       <w:outlineLvl w:val="0"/>
-      <w:jc w:val="right"/>
-    </w:pPr>
-    <w:rPr>
-      <w:rFonts w:ascii="Traditional Arabic" w:hAnsi="Traditional Arabic" w:eastAsia="Traditional Arabic" w:cs="Traditional Arabic"/>
+    </w:pPr>
+    <w:rPr>
+      <w:rFonts w:asciiTheme="majorHAnsi" w:eastAsiaTheme="majorEastAsia" w:hAnsiTheme="majorHAnsi" w:cstheme="majorBidi"/>
       <w:color w:val="2E74B5" w:themeColor="accent1" w:themeShade="BF"/>
       <w:sz w:val="32"/>
       <w:szCs w:val="32"/>
-      <w:lang w:val="en-US" w:eastAsia="en-US" w:bidi="ar-SA"/>
     </w:rPr>
   </w:style>
   <w:style w:type="paragraph" w:styleId="Heading2">
@@ -704,15 +687,14 @@
     <w:pPr>
       <w:keepNext/>
       <w:keepLines/>
+      <w:spacing w:before="160" w:after="80"/>
       <w:outlineLvl w:val="1"/>
-      <w:jc w:val="right"/>
-    </w:pPr>
-    <w:rPr>
-      <w:rFonts w:ascii="Traditional Arabic" w:hAnsi="Traditional Arabic" w:eastAsia="Traditional Arabic" w:cs="Traditional Arabic"/>
+    </w:pPr>
+    <w:rPr>
+      <w:rFonts w:asciiTheme="majorHAnsi" w:eastAsiaTheme="majorEastAsia" w:hAnsiTheme="majorHAnsi" w:cstheme="majorBidi"/>
       <w:color w:val="2E74B5" w:themeColor="accent1" w:themeShade="BF"/>
       <w:sz w:val="26"/>
       <w:szCs w:val="26"/>
-      <w:lang w:val="en-US" w:eastAsia="en-US" w:bidi="ar-SA"/>
     </w:rPr>
   </w:style>
   <w:style w:type="paragraph" w:styleId="Heading3">
@@ -726,15 +708,14 @@
     <w:pPr>
       <w:keepNext/>
       <w:keepLines/>
+      <w:spacing w:before="160" w:after="80"/>
       <w:outlineLvl w:val="2"/>
-      <w:jc w:val="right"/>
-    </w:pPr>
-    <w:rPr>
-      <w:rFonts w:ascii="Traditional Arabic" w:hAnsi="Traditional Arabic" w:eastAsia="Traditional Arabic" w:cs="Traditional Arabic"/>
+    </w:pPr>
+    <w:rPr>
+      <w:rFonts w:eastAsiaTheme="majorEastAsia" w:cstheme="majorBidi"/>
       <w:color w:val="1F4D78" w:themeColor="accent1" w:themeShade="BF"/>
       <w:sz w:val="24"/>
       <w:szCs w:val="24"/>
-      <w:lang w:val="en-US" w:eastAsia="en-US" w:bidi="ar-SA"/>
     </w:rPr>
   </w:style>
   <w:style w:type="paragraph" w:styleId="Heading4">
@@ -748,15 +729,14 @@
     <w:pPr>
       <w:keepNext/>
       <w:keepLines/>
+      <w:spacing w:before="80" w:after="40"/>
       <w:outlineLvl w:val="3"/>
-      <w:jc w:val="right"/>
-    </w:pPr>
-    <w:rPr>
-      <w:rFonts w:ascii="Traditional Arabic" w:hAnsi="Traditional Arabic" w:eastAsia="Traditional Arabic" w:cs="Traditional Arabic"/>
+    </w:pPr>
+    <w:rPr>
+      <w:rFonts w:eastAsiaTheme="majorEastAsia" w:cstheme="majorBidi"/>
       <w:i/>
       <w:iCs/>
       <w:color w:val="2E74B5" w:themeColor="accent1" w:themeShade="BF"/>
-      <w:lang w:val="en-US" w:eastAsia="en-US" w:bidi="ar-SA"/>
     </w:rPr>
   </w:style>
   <w:style w:type="paragraph" w:styleId="Heading5">
@@ -765,8 +745,6 @@
     <w:next w:val="BodyText"/>
     <w:link w:val="Heading5Char"/>
     <w:uiPriority w:val="9"/>
-    <w:semiHidden/>
-    <w:unhideWhenUsed/>
     <w:qFormat/>
     <w:rsid w:val="00A10FD9"/>
     <w:pPr>
@@ -777,7 +755,7 @@
     </w:pPr>
     <w:rPr>
       <w:rFonts w:eastAsiaTheme="majorEastAsia" w:cstheme="majorBidi"/>
-      <w:color w:val="0F4761" w:themeColor="accent1" w:themeShade="BF"/>
+      <w:color w:val="2E74B5" w:themeColor="accent1" w:themeShade="BF"/>
     </w:rPr>
   </w:style>
   <w:style w:type="paragraph" w:styleId="Heading6">
@@ -786,8 +764,6 @@
     <w:next w:val="BodyText"/>
     <w:link w:val="Heading6Char"/>
     <w:uiPriority w:val="9"/>
-    <w:semiHidden/>
-    <w:unhideWhenUsed/>
     <w:qFormat/>
     <w:rsid w:val="00A10FD9"/>
     <w:pPr>
@@ -800,7 +776,7 @@
       <w:rFonts w:eastAsiaTheme="majorEastAsia" w:cstheme="majorBidi"/>
       <w:i/>
       <w:iCs/>
-      <w:color w:val="595959" w:themeColor="text1" w:themeTint="A6"/>
+      <w:color w:val="1F4D78" w:themeColor="text1" w:themeTint="A6"/>
     </w:rPr>
   </w:style>
   <w:style w:type="paragraph" w:styleId="Heading7">
@@ -1001,8 +977,7 @@
   </w:style>
   <w:style w:type="paragraph" w:styleId="FootnoteText">
     <w:pPr>
-      <w:jc w:val="right"/>
-      <w:spacing w:line="240" w:lineRule="auto"/>
+      <w:spacing w:after="0" w:line="240" w:lineRule="auto"/>
     </w:pPr>
     <w:name w:val="Footnote Text"/>
     <w:basedOn w:val="Normal"/>
@@ -1010,10 +985,8 @@
     <w:uiPriority w:val="9"/>
     <w:qFormat/>
     <w:rPr>
-      <w:rFonts w:ascii="Traditional Arabic" w:hAnsi="Traditional Arabic" w:eastAsia="Traditional Arabic" w:cs="Traditional Arabic"/>
       <w:sz w:val="20"/>
       <w:szCs w:val="20"/>
-      <w:lang w:val="en-US" w:eastAsia="en-US" w:bidi="ar-SA"/>
     </w:rPr>
   </w:style>
   <w:style w:type="paragraph" w:styleId="FootnoteBlockText">
@@ -1034,11 +1007,10 @@
     <w:unhideWhenUsed/>
   </w:style>
   <w:style w:type="table" w:default="1" w:styleId="Table">
-    <w:pPr>
-      <w:jc w:val="right"/>
-    </w:pPr>
     <w:name w:val="Table"/>
     <w:basedOn w:val="TableNormal"/>
+    <w:semiHidden/>
+    <w:unhideWhenUsed/>
     <w:qFormat/>
     <w:tblPr>
       <w:tblInd w:w="0" w:type="dxa"/>
@@ -1057,10 +1029,6 @@
         <w:vAlign w:val="bottom"/>
       </w:tcPr>
     </w:tblStylePr>
-    <w:rPr>
-      <w:rFonts w:ascii="Traditional Arabic" w:hAnsi="Traditional Arabic" w:eastAsia="Traditional Arabic" w:cs="Traditional Arabic"/>
-      <w:lang w:val="en-US" w:eastAsia="en-US" w:bidi="ar-SA"/>
-    </w:rPr>
   </w:style>
   <w:style w:type="paragraph" w:customStyle="1" w:styleId="DefinitionTerm">
     <w:name w:val="Definition Term"/>
@@ -1140,7 +1108,7 @@
     <w:name w:val="Hyperlink"/>
     <w:basedOn w:val="BodyTextChar"/>
     <w:rPr>
-      <w:color w:val="4F81BD" w:themeColor="accent1"/>
+      <w:color w:val="0563C1" w:themeColor="accent1"/>
     </w:rPr>
   </w:style>
   <w:style w:type="paragraph" w:styleId="TOCHeading">

</xml_diff>

<commit_message>
feat: major cleanup - gitignore, XML compression, infrastructure tracking
- .gitignore: comprehensive patterns (desktop.ini, *.xlsm, Academic_References/,
  Final_Delivery_Layout/, _tmp.driveupload/, runtime data, generated reports)
- XML context files: erp-project-context 1061->253 lines, erp-agent-handoff 185->102,
  erp-skills-projection 173->91 lines (token-efficient rewrite)
- Tracked: .opencode/bootstrap/ (3 files), vbe-auto/, vbe-auto-template/,
  milestone_13_2/ (config, tests, RAG, recap), 3 utility .ps1 scripts
- Thesis: build-thesis.ps1 pipeline updated, customize-reference.py enhanced,
  new format-cover.py, SESSION_HANDOFF.md tracked, old DOCX deleted
- academix-launcher.ps1: 2 stale paths fixed
</commit_message>
<xml_diff>
--- a/Thesis_Surgical_Edit/style/reference.docx
+++ b/Thesis_Surgical_Edit/style/reference.docx
@@ -667,12 +667,16 @@
       <w:keepNext/>
       <w:keepLines/>
       <w:spacing w:before="360" w:after="80"/>
+      <w:jc w:val="right"/>
       <w:outlineLvl w:val="0"/>
-    </w:pPr>
-    <w:rPr>
-      <w:rFonts w:asciiTheme="majorHAnsi" w:eastAsiaTheme="majorEastAsia" w:hAnsiTheme="majorHAnsi" w:cstheme="majorBidi"/>
-      <w:color w:val="2E74B5" w:themeColor="accent1" w:themeShade="BF"/>
-      <w:sz w:val="32"/>
+      <w:keepNext/>
+      <w:keepLines/>
+    </w:pPr>
+    <w:rPr>
+      <w:rFonts w:asciiTheme="majorHAnsi" w:eastAsiaTheme="majorEastAsia" w:hAnsiTheme="majorHAnsi" w:cstheme="majorBidi" w:ascii="Traditional Arabic" w:hAnsi="Traditional Arabic"/>
+      <w:b/>
+      <w:color w:val="1B2631"/>
+      <w:sz w:val="44"/>
       <w:szCs w:val="32"/>
     </w:rPr>
   </w:style>
@@ -688,12 +692,16 @@
       <w:keepNext/>
       <w:keepLines/>
       <w:spacing w:before="160" w:after="80"/>
+      <w:jc w:val="right"/>
       <w:outlineLvl w:val="1"/>
-    </w:pPr>
-    <w:rPr>
-      <w:rFonts w:asciiTheme="majorHAnsi" w:eastAsiaTheme="majorEastAsia" w:hAnsiTheme="majorHAnsi" w:cstheme="majorBidi"/>
-      <w:color w:val="2E74B5" w:themeColor="accent1" w:themeShade="BF"/>
-      <w:sz w:val="26"/>
+      <w:keepNext/>
+      <w:keepLines/>
+    </w:pPr>
+    <w:rPr>
+      <w:rFonts w:asciiTheme="majorHAnsi" w:eastAsiaTheme="majorEastAsia" w:hAnsiTheme="majorHAnsi" w:cstheme="majorBidi" w:ascii="Traditional Arabic" w:hAnsi="Traditional Arabic"/>
+      <w:b/>
+      <w:color w:val="0C447C"/>
+      <w:sz w:val="36"/>
       <w:szCs w:val="26"/>
     </w:rPr>
   </w:style>
@@ -709,12 +717,16 @@
       <w:keepNext/>
       <w:keepLines/>
       <w:spacing w:before="160" w:after="80"/>
+      <w:jc w:val="right"/>
       <w:outlineLvl w:val="2"/>
-    </w:pPr>
-    <w:rPr>
-      <w:rFonts w:eastAsiaTheme="majorEastAsia" w:cstheme="majorBidi"/>
-      <w:color w:val="1F4D78" w:themeColor="accent1" w:themeShade="BF"/>
-      <w:sz w:val="24"/>
+      <w:keepNext/>
+      <w:keepLines/>
+    </w:pPr>
+    <w:rPr>
+      <w:rFonts w:eastAsiaTheme="majorEastAsia" w:cstheme="majorBidi" w:ascii="Traditional Arabic" w:hAnsi="Traditional Arabic"/>
+      <w:b/>
+      <w:color w:val="0C447C"/>
+      <w:sz w:val="32"/>
       <w:szCs w:val="24"/>
     </w:rPr>
   </w:style>
@@ -1108,7 +1120,7 @@
     <w:name w:val="Hyperlink"/>
     <w:basedOn w:val="BodyTextChar"/>
     <w:rPr>
-      <w:color w:val="0563C1" w:themeColor="accent1"/>
+      <w:color w:val="4F81BD" w:themeColor="accent1"/>
     </w:rPr>
   </w:style>
   <w:style w:type="paragraph" w:styleId="TOCHeading">

</xml_diff>

<commit_message>
feat: implement autoclean/status modes, CI workflow, changelog, and profile shortcuts
- OpenCode.bat v3.3: add autoclean (30-day purge) and status (health overview) modes
- profile.ps1: add autoclean/status functions, update welcome message
- verify.ps1: output results to vbe-auto/results/ subdirectory
- GitHub Actions CI workflow: structure validation on push/PR
- CHANGELOG.md: generated from full git history
- erp-context-compact.md: update launcher version (v3.1->v3.3, 13->26 modes)
- slash commands: add autoclean.md and status.md
- .gitignore: add .tmp.driveupload/ to ignored paths
</commit_message>
<xml_diff>
--- a/Thesis_Surgical_Edit/style/reference.docx
+++ b/Thesis_Surgical_Edit/style/reference.docx
@@ -318,7 +318,7 @@
         <w:numRestart w:val="eachSect"/>
       </w:footnotePr>
       <w:pgSz w:w="11906" w:h="16838"/>
-      <w:pgMar w:top="1440" w:bottom="1440" w:left="1701" w:right="1701"/>
+      <w:pgMar w:top="2275" w:bottom="2275" w:left="2275" w:right="2275"/>
     </w:sectPr>
   </w:body>
 </w:document>
@@ -487,17 +487,22 @@
   <w:docDefaults>
     <w:rPrDefault>
       <w:rPr>
-        <w:rFonts w:ascii="Traditional Arabic" w:cs="Traditional Arabic" w:eastAsia="Traditional Arabic" w:hAnsi="Traditional Arabic"/>
-        <w:sz w:val="24"/>
-        <w:szCs w:val="24"/>
+        <w:rFonts w:ascii="Traditional Arabic" w:eastAsia="Traditional Arabic" w:hAnsi="Traditional Arabic" w:cs="Traditional Arabic"/>
+        <w:sz w:val="28"/>
+        <w:szCs w:val="28"/>
+        <w:lang w:val="en-US" w:eastAsia="en-US" w:bidi="ar-SA"/>
       </w:rPr>
     </w:rPrDefault>
     <w:pPrDefault/>
   </w:docDefaults>
   <w:latentStyles w:defLockedState="0" w:defUIPriority="0" w:defSemiHidden="0" w:defUnhideWhenUsed="0" w:defQFormat="0" w:count="276"/>
   <w:style w:type="paragraph" w:default="1" w:styleId="Normal">
+    <w:pPr>
+      <w:spacing w:line="360" w:lineRule="auto"/>
+    </w:pPr>
     <w:name w:val="Normal"/>
     <w:qFormat/>
+    <w:rPr/>
   </w:style>
   <w:style w:type="paragraph" w:styleId="BodyText">
     <w:name w:val="Body Text"/>
@@ -989,7 +994,7 @@
   </w:style>
   <w:style w:type="paragraph" w:styleId="FootnoteText">
     <w:pPr>
-      <w:spacing w:after="0" w:line="240" w:lineRule="auto"/>
+      <w:spacing w:line="240" w:lineRule="auto"/>
     </w:pPr>
     <w:name w:val="Footnote Text"/>
     <w:basedOn w:val="Normal"/>

</xml_diff>

<commit_message>
docs: update thesis outline, terminology, build pipeline
- Update chapter outline with CNEPD-compliant structure
- Update terminology mapping (SIGLE, Law 23-12, public sector)
- Fix build-thesis.ps1 to include docx-style-apply step
- Update reference.docx and style pipeline
</commit_message>
<xml_diff>
--- a/Thesis_Surgical_Edit/style/reference.docx
+++ b/Thesis_Surgical_Edit/style/reference.docx
@@ -318,7 +318,7 @@
         <w:numRestart w:val="eachSect"/>
       </w:footnotePr>
       <w:pgSz w:w="11906" w:h="16838"/>
-      <w:pgMar w:top="2275" w:bottom="2275" w:left="2275" w:right="2275"/>
+      <w:pgMar w:top="1417" w:bottom="1417" w:left="1417" w:right="1417"/>
     </w:sectPr>
   </w:body>
 </w:document>
@@ -493,7 +493,11 @@
         <w:lang w:val="en-US" w:eastAsia="en-US" w:bidi="ar-SA"/>
       </w:rPr>
     </w:rPrDefault>
-    <w:pPrDefault/>
+    <w:pPrDefault>
+      <w:pPr>
+        <w:spacing w:line="360" w:lineRule="auto"/>
+      </w:pPr>
+    </w:pPrDefault>
   </w:docDefaults>
   <w:latentStyles w:defLockedState="0" w:defUIPriority="0" w:defSemiHidden="0" w:defUnhideWhenUsed="0" w:defQFormat="0" w:count="276"/>
   <w:style w:type="paragraph" w:default="1" w:styleId="Normal">

</xml_diff>

<commit_message>
feat: complete 7-stage execution — 4 VBA pillars + harvest + cross-ref + final audit
Stage 1: Expanded decision history in MASTER_BOOTSTRAP.xml (3→6 phases, 16 decisions)
Stage 2: Compact Print — mod_ExportEngine.bas (A5, condensed, dual ORIGINAL/COPIE)
Stage 3: UX Preload — frmStockEntry.frm (input masking, auto BS- prefix, color feedback)
Stage 4: Stockout Projection — mod_Dashboard.bas (days-to-stockout, conditional coloring)
Stage 5: Fuzzy Search — mod_DataValidator.bas (Levenshtein, SoundexFR, orphan suggestions)
Stage 6: Cross-ref update — erp-project-context.xml (new APIs, module count, call-graph)
Stage 7: Final audit — COMPILE OK, 174/174 PASS, 16/16 DSS PASS

Bugs: fixed duplicate Dim colFontSize, c used-before-declaration in PopulateTemplateBon
Chore: thesis AI logs archived, vbe-auto config migrated, DOCX style scripts cleaned
</commit_message>
<xml_diff>
--- a/Thesis_Surgical_Edit/style/reference.docx
+++ b/Thesis_Surgical_Edit/style/reference.docx
@@ -317,7 +317,7 @@
       <w:footnotePr>
         <w:numRestart w:val="eachSect"/>
       </w:footnotePr>
-      <w:pgSz w:w="11906" w:h="16838"/>
+      <w:pgSz w:w="12240" w:h="15840"/>
       <w:pgMar w:top="1417" w:bottom="1417" w:left="1417" w:right="1417"/>
     </w:sectPr>
   </w:body>
@@ -490,7 +490,7 @@
         <w:rFonts w:ascii="Traditional Arabic" w:eastAsia="Traditional Arabic" w:hAnsi="Traditional Arabic" w:cs="Traditional Arabic"/>
         <w:sz w:val="28"/>
         <w:szCs w:val="28"/>
-        <w:lang w:val="en-US" w:eastAsia="en-US" w:bidi="ar-SA"/>
+        <w:lang w:val="en-US" w:eastAsia="en-US" w:bidi="ar"/>
       </w:rPr>
     </w:rPrDefault>
     <w:pPrDefault>
@@ -501,12 +501,11 @@
   </w:docDefaults>
   <w:latentStyles w:defLockedState="0" w:defUIPriority="0" w:defSemiHidden="0" w:defUnhideWhenUsed="0" w:defQFormat="0" w:count="276"/>
   <w:style w:type="paragraph" w:default="1" w:styleId="Normal">
-    <w:pPr>
-      <w:spacing w:line="360" w:lineRule="auto"/>
-    </w:pPr>
     <w:name w:val="Normal"/>
     <w:qFormat/>
-    <w:rPr/>
+    <w:rPr>
+      <w:rFonts w:cs="Times New Roman"/>
+    </w:rPr>
   </w:style>
   <w:style w:type="paragraph" w:styleId="BodyText">
     <w:name w:val="Body Text"/>
@@ -516,12 +515,14 @@
     <w:pPr>
       <w:spacing w:before="180" w:after="180"/>
     </w:pPr>
+    <w:rPr/>
   </w:style>
   <w:style w:type="paragraph" w:customStyle="1" w:styleId="FirstParagraph">
     <w:name w:val="First Paragraph"/>
     <w:basedOn w:val="BodyText"/>
     <w:next w:val="BodyText"/>
     <w:qFormat/>
+    <w:rPr/>
   </w:style>
   <w:style w:type="paragraph" w:customStyle="1" w:styleId="Compact">
     <w:name w:val="Compact"/>
@@ -530,6 +531,7 @@
     <w:pPr>
       <w:spacing w:before="36" w:after="36"/>
     </w:pPr>
+    <w:rPr/>
   </w:style>
   <w:style w:type="paragraph" w:styleId="Title">
     <w:name w:val="Title"/>
@@ -676,17 +678,17 @@
       <w:keepNext/>
       <w:keepLines/>
       <w:spacing w:before="360" w:after="80"/>
+      <w:outlineLvl w:val="0"/>
       <w:jc w:val="right"/>
-      <w:outlineLvl w:val="0"/>
       <w:keepNext/>
       <w:keepLines/>
     </w:pPr>
     <w:rPr>
       <w:rFonts w:asciiTheme="majorHAnsi" w:eastAsiaTheme="majorEastAsia" w:hAnsiTheme="majorHAnsi" w:cstheme="majorBidi" w:ascii="Traditional Arabic" w:hAnsi="Traditional Arabic"/>
-      <w:b/>
       <w:color w:val="1B2631"/>
       <w:sz w:val="44"/>
       <w:szCs w:val="32"/>
+      <w:b/>
     </w:rPr>
   </w:style>
   <w:style w:type="paragraph" w:styleId="Heading2">
@@ -701,17 +703,17 @@
       <w:keepNext/>
       <w:keepLines/>
       <w:spacing w:before="160" w:after="80"/>
+      <w:outlineLvl w:val="1"/>
       <w:jc w:val="right"/>
-      <w:outlineLvl w:val="1"/>
       <w:keepNext/>
       <w:keepLines/>
     </w:pPr>
     <w:rPr>
       <w:rFonts w:asciiTheme="majorHAnsi" w:eastAsiaTheme="majorEastAsia" w:hAnsiTheme="majorHAnsi" w:cstheme="majorBidi" w:ascii="Traditional Arabic" w:hAnsi="Traditional Arabic"/>
-      <w:b/>
       <w:color w:val="0C447C"/>
       <w:sz w:val="36"/>
       <w:szCs w:val="26"/>
+      <w:b/>
     </w:rPr>
   </w:style>
   <w:style w:type="paragraph" w:styleId="Heading3">
@@ -726,17 +728,17 @@
       <w:keepNext/>
       <w:keepLines/>
       <w:spacing w:before="160" w:after="80"/>
+      <w:outlineLvl w:val="2"/>
       <w:jc w:val="right"/>
-      <w:outlineLvl w:val="2"/>
       <w:keepNext/>
       <w:keepLines/>
     </w:pPr>
     <w:rPr>
       <w:rFonts w:eastAsiaTheme="majorEastAsia" w:cstheme="majorBidi" w:ascii="Traditional Arabic" w:hAnsi="Traditional Arabic"/>
-      <w:b/>
       <w:color w:val="0C447C"/>
       <w:sz w:val="32"/>
       <w:szCs w:val="24"/>
+      <w:b/>
     </w:rPr>
   </w:style>
   <w:style w:type="paragraph" w:styleId="Heading4">
@@ -757,7 +759,7 @@
       <w:rFonts w:eastAsiaTheme="majorEastAsia" w:cstheme="majorBidi"/>
       <w:i/>
       <w:iCs/>
-      <w:color w:val="2E74B5" w:themeColor="accent1" w:themeShade="BF"/>
+      <w:color w:val="0F4761" w:themeColor="accent1" w:themeShade="BF"/>
     </w:rPr>
   </w:style>
   <w:style w:type="paragraph" w:styleId="Heading5">
@@ -776,7 +778,7 @@
     </w:pPr>
     <w:rPr>
       <w:rFonts w:eastAsiaTheme="majorEastAsia" w:cstheme="majorBidi"/>
-      <w:color w:val="2E74B5" w:themeColor="accent1" w:themeShade="BF"/>
+      <w:color w:val="0F4761" w:themeColor="accent1" w:themeShade="BF"/>
     </w:rPr>
   </w:style>
   <w:style w:type="paragraph" w:styleId="Heading6">
@@ -797,7 +799,7 @@
       <w:rFonts w:eastAsiaTheme="majorEastAsia" w:cstheme="majorBidi"/>
       <w:i/>
       <w:iCs/>
-      <w:color w:val="1F4D78" w:themeColor="text1" w:themeTint="A6"/>
+      <w:color w:val="595959" w:themeColor="text1" w:themeTint="A6"/>
     </w:rPr>
   </w:style>
   <w:style w:type="paragraph" w:styleId="Heading7">
@@ -806,8 +808,6 @@
     <w:next w:val="BodyText"/>
     <w:link w:val="Heading7Char"/>
     <w:uiPriority w:val="9"/>
-    <w:semiHidden/>
-    <w:unhideWhenUsed/>
     <w:qFormat/>
     <w:rsid w:val="00A10FD9"/>
     <w:pPr>
@@ -827,8 +827,6 @@
     <w:next w:val="BodyText"/>
     <w:link w:val="Heading8Char"/>
     <w:uiPriority w:val="9"/>
-    <w:semiHidden/>
-    <w:unhideWhenUsed/>
     <w:qFormat/>
     <w:rsid w:val="00A10FD9"/>
     <w:pPr>
@@ -850,8 +848,6 @@
     <w:next w:val="BodyText"/>
     <w:link w:val="Heading9Char"/>
     <w:uiPriority w:val="9"/>
-    <w:semiHidden/>
-    <w:unhideWhenUsed/>
     <w:qFormat/>
     <w:rsid w:val="00A10FD9"/>
     <w:pPr>
@@ -989,12 +985,12 @@
     <w:basedOn w:val="BodyText"/>
     <w:next w:val="BodyText"/>
     <w:uiPriority w:val="9"/>
-    <w:unhideWhenUsed/>
     <w:qFormat/>
     <w:pPr>
       <w:spacing w:before="100" w:after="100"/>
       <w:ind w:firstLine="0" w:left="480" w:right="480"/>
     </w:pPr>
+    <w:rPr/>
   </w:style>
   <w:style w:type="paragraph" w:styleId="FootnoteText">
     <w:pPr>
@@ -1015,12 +1011,12 @@
     <w:basedOn w:val="FootnoteText"/>
     <w:next w:val="FootnoteText"/>
     <w:uiPriority w:val="9"/>
-    <w:unhideWhenUsed/>
     <w:qFormat/>
     <w:pPr>
       <w:spacing w:before="100" w:after="100"/>
       <w:ind w:firstLine="0" w:left="480" w:right="480"/>
     </w:pPr>
+    <w:rPr/>
   </w:style>
   <w:style w:type="character" w:default="1" w:styleId="DefaultParagraphFont">
     <w:name w:val="Default Paragraph Font"/>
@@ -1067,6 +1063,7 @@
   <w:style w:type="paragraph" w:customStyle="1" w:styleId="Definition">
     <w:name w:val="Definition"/>
     <w:basedOn w:val="Normal"/>
+    <w:rPr/>
   </w:style>
   <w:style w:type="paragraph" w:styleId="Caption">
     <w:name w:val="Caption"/>
@@ -1085,14 +1082,17 @@
     <w:pPr>
       <w:keepNext/>
     </w:pPr>
+    <w:rPr/>
   </w:style>
   <w:style w:type="paragraph" w:customStyle="1" w:styleId="ImageCaption">
     <w:name w:val="Image Caption"/>
     <w:basedOn w:val="Caption"/>
+    <w:rPr/>
   </w:style>
   <w:style w:type="paragraph" w:customStyle="1" w:styleId="Figure">
     <w:name w:val="Figure"/>
     <w:basedOn w:val="Normal"/>
+    <w:rPr/>
   </w:style>
   <w:style w:type="paragraph" w:customStyle="1" w:styleId="CaptionedFigure">
     <w:name w:val="Captioned Figure"/>
@@ -1100,6 +1100,7 @@
     <w:pPr>
       <w:keepNext/>
     </w:pPr>
+    <w:rPr/>
   </w:style>
   <w:style w:type="character" w:customStyle="1" w:styleId="BodyTextChar">
     <w:name w:val="Body Text Char"/>
@@ -1137,7 +1138,6 @@
     <w:basedOn w:val="Heading1"/>
     <w:next w:val="BodyText"/>
     <w:uiPriority w:val="39"/>
-    <w:unhideWhenUsed/>
     <w:qFormat/>
     <w:pPr>
       <w:spacing w:before="240" w:line="259" w:lineRule="auto"/>
@@ -1147,7 +1147,7 @@
       <w:rFonts w:asciiTheme="majorHAnsi" w:eastAsiaTheme="majorEastAsia" w:hAnsiTheme="majorHAnsi" w:cstheme="majorBidi"/>
       <w:b w:val="0"/>
       <w:bCs w:val="0"/>
-      <w:color w:val="365F91" w:themeColor="accent1" w:themeShade="BF"/>
+      <w:color w:val="0F4761" w:themeColor="accent1" w:themeShade="BF"/>
     </w:rPr>
   </w:style>
 </w:styles>

</xml_diff>

<commit_message>
chore: restore pipeline scripts, merge Desktop content, clean up infrastructure
- Restore 9 deleted pipeline scripts from git history
  (footnotes.py, build-cover-page.py, build-bismillah.py, prepend-bismillah.py,
   inject-references.py, build-master-refs.py, compare-thesis.py,
   measure-thesis.py, verify-thesis.ps1)
- Generate bismillah-page.docx, master-references.json, pdf-mapping.json
- Merge Desktop-only files: Completion_Certificate.docx,
  Executive_Summary.docx, English_Research_Paper.md into project
- Merge internship evidence (24 photos) into evidence/internship/
- Merge course materials and seance Excel examples into references/
- Archive old ERP workbook builds into _archive/old-workbook-builds/
- Archive stale Claude conversation exports into claude-context/_archive/
- Fix .worktrees/index.json (repair corrupted JSON)
- Add bin/ and .worktrees/ to .gitignore
</commit_message>
<xml_diff>
--- a/Thesis_Surgical_Edit/style/reference.docx
+++ b/Thesis_Surgical_Edit/style/reference.docx
@@ -487,10 +487,10 @@
   <w:docDefaults>
     <w:rPrDefault>
       <w:rPr>
-        <w:rFonts w:ascii="Traditional Arabic" w:eastAsia="Traditional Arabic" w:hAnsi="Traditional Arabic" w:cs="Traditional Arabic"/>
+        <w:rFonts w:ascii="Traditional Arabic" w:cs="Traditional Arabic" w:eastAsia="Traditional Arabic" w:hAnsi="Traditional Arabic"/>
         <w:sz w:val="28"/>
         <w:szCs w:val="28"/>
-        <w:lang w:val="en-US" w:eastAsia="en-US" w:bidi="ar"/>
+        <w:lang w:bidi="ar" w:eastAsia="en-US" w:val="en-US"/>
       </w:rPr>
     </w:rPrDefault>
     <w:pPrDefault>

</xml_diff>

<commit_message>
feat: full pipeline golden — orphan modules resolved, audit enhanced, memory updated
Build: 35 .bas + 1 .frm | COMPILE OK | 811.3 KB | 12,027 lines
Verify: 105/105 PASS | 0 FAILED
Audit: 17/17 PASS | 0 WARNINGS (orphans 21→0)
Tests: 20/20 PASS

Key changes:
- Orphan modules resolved (21→0), error handling 100% (34/34)
- mod_EntryPoints + mod_SheetSetup archived to VBA_Modules/ARCHIVED/
- DSS audit enhanced with detailed warning/error logging
- All memory files updated (OMC checkpoint, project-memory, notepad, HANDOFF)
- CLI notification skill scaffold added (.opencode/skills/cli-notification/)
- Thesis review package added (Thesis_For_Claude_Review/)
- Infrastructure: harness, bg-worker, autonomous-agent scripts updated
- vbe-auto config created for build pipeline
</commit_message>
<xml_diff>
--- a/Thesis_Surgical_Edit/style/reference.docx
+++ b/Thesis_Surgical_Edit/style/reference.docx
@@ -487,10 +487,10 @@
   <w:docDefaults>
     <w:rPrDefault>
       <w:rPr>
-        <w:rFonts w:ascii="Traditional Arabic" w:cs="Traditional Arabic" w:eastAsia="Traditional Arabic" w:hAnsi="Traditional Arabic"/>
+        <w:rFonts w:ascii="Traditional Arabic" w:eastAsia="Traditional Arabic" w:hAnsi="Traditional Arabic" w:cs="Traditional Arabic"/>
         <w:sz w:val="28"/>
         <w:szCs w:val="28"/>
-        <w:lang w:bidi="ar" w:eastAsia="en-US" w:val="en-US"/>
+        <w:lang w:val="en-US" w:eastAsia="en-US" w:bidi="ar"/>
       </w:rPr>
     </w:rPrDefault>
     <w:pPrDefault>

</xml_diff>

<commit_message>
feat: ultimate build complete — 67 footnotes, DOCX 140 KB, all tools connected
- Added all-footnotes.py: comprehensive footnote generator for all 56 bibliography entries
- Integrated all-footnotes step into build-thesis.ps1 pipeline
- Fixed Word COM read-only mode to preserve section breaks
- DOCX: 140 KB (exceeds 114KB requirement), PDF: 1,095 KB
- 67 footnotes total (12 inline + 55 bibliography)
- Verify: 25/25 PASS, 0 regressions
- All state files updated (HANDOFF, notepad, memory, project-memory)
- Added diagnostic tools: analyze-docx.py, check-sections.py
- Multi-agent workflow ready, engineering harness fully operational
</commit_message>
<xml_diff>
--- a/Thesis_Surgical_Edit/style/reference.docx
+++ b/Thesis_Surgical_Edit/style/reference.docx
@@ -487,10 +487,10 @@
   <w:docDefaults>
     <w:rPrDefault>
       <w:rPr>
-        <w:rFonts w:ascii="Traditional Arabic" w:eastAsia="Traditional Arabic" w:hAnsi="Traditional Arabic" w:cs="Traditional Arabic"/>
+        <w:rFonts w:ascii="Traditional Arabic" w:cs="Traditional Arabic" w:eastAsia="Traditional Arabic" w:hAnsi="Traditional Arabic"/>
         <w:sz w:val="28"/>
         <w:szCs w:val="28"/>
-        <w:lang w:val="en-US" w:eastAsia="en-US" w:bidi="ar"/>
+        <w:lang w:bidi="ar" w:eastAsia="en-US" w:val="en-US"/>
       </w:rPr>
     </w:rPrDefault>
     <w:pPrDefault>

</xml_diff>